<commit_message>
Add quote reject, recall, and email approval to user guide
Expand section 8 with Approval History Approve/Reject/Recall steps,
email approval flow, status rules, and screenshots from the Vignesh notes.

Co-authored-by: vignesh-2417 <vignesh-2417@users.noreply.github.com>
</commit_message>
<xml_diff>
--- a/docs/vulcan-user-guide/Vulcan-Industries-Salesforce-User-Guide.docx
+++ b/docs/vulcan-user-guide/Vulcan-Industries-Salesforce-User-Guide.docx
@@ -2806,6 +2806,57 @@
         <w:t>If the quote margin is less than 10%, clicking Submit for Approval routes the quote to a VP user for approval.</w:t>
       </w:r>
     </w:p>
+    <w:tbl>
+      <w:tblPr>
+        <w:tblW w:type="auto" w:w="0"/>
+        <w:jc w:val="center"/>
+        <w:tblLook w:firstColumn="1" w:firstRow="1" w:lastColumn="0" w:lastRow="0" w:noHBand="0" w:noVBand="1" w:val="04A0"/>
+      </w:tblPr>
+      <w:tblGrid>
+        <w:gridCol w:w="9648"/>
+      </w:tblGrid>
+      <w:tr>
+        <w:tc>
+          <w:tcPr>
+            <w:tcW w:type="dxa" w:w="9648"/>
+            <w:shd w:fill="FFF4E5" w:val="clear"/>
+          </w:tcPr>
+          <w:p>
+            <w:pPr>
+              <w:spacing w:before="80" w:after="40" w:lineRule="auto" w:line="276"/>
+            </w:pPr>
+            <w:r>
+              <w:rPr>
+                <w:rFonts w:ascii="Calibri" w:hAnsi="Calibri" w:eastAsia="Calibri"/>
+                <w:b/>
+                <w:color w:val="017EC5"/>
+                <w:sz w:val="20"/>
+              </w:rPr>
+              <w:t>STATUS RULE</w:t>
+            </w:r>
+          </w:p>
+          <w:p>
+            <w:pPr>
+              <w:spacing w:before="0" w:after="80" w:lineRule="auto" w:line="276"/>
+            </w:pPr>
+            <w:r>
+              <w:rPr>
+                <w:rFonts w:ascii="Calibri" w:hAnsi="Calibri" w:eastAsia="Calibri"/>
+                <w:b w:val="0"/>
+                <w:color w:val="181818"/>
+                <w:sz w:val="20"/>
+              </w:rPr>
+              <w:t>Approval Status should be updated to Needs Approval when the approval condition is met (for example, margin below the approved threshold).</w:t>
+            </w:r>
+          </w:p>
+        </w:tc>
+      </w:tr>
+    </w:tbl>
+    <w:p>
+      <w:pPr>
+        <w:spacing w:before="0" w:after="160" w:lineRule="auto" w:line="276"/>
+      </w:pPr>
+    </w:p>
     <w:p>
       <w:pPr>
         <w:pStyle w:val="Heading2"/>
@@ -2832,7 +2883,7 @@
           <w:color w:val="181818"/>
           <w:sz w:val="22"/>
         </w:rPr>
-        <w:t xml:space="preserve">Quote status / approval status moves to </w:t>
+        <w:t xml:space="preserve">Once submitted for approval, the quote status changes to </w:t>
       </w:r>
       <w:r>
         <w:rPr>
@@ -2871,6 +2922,112 @@
     </w:p>
     <w:p>
       <w:pPr>
+        <w:pStyle w:val="ListBullet"/>
+        <w:spacing w:before="0" w:after="80" w:lineRule="auto" w:line="276"/>
+        <w:ind w:left="360"/>
+      </w:pPr>
+      <w:r>
+        <w:rPr>
+          <w:rFonts w:ascii="Calibri" w:hAnsi="Calibri" w:eastAsia="Calibri"/>
+          <w:b w:val="0"/>
+          <w:color w:val="181818"/>
+          <w:sz w:val="22"/>
+        </w:rPr>
+        <w:t xml:space="preserve">After submit, the Quote </w:t>
+      </w:r>
+      <w:r>
+        <w:rPr>
+          <w:rFonts w:ascii="Calibri" w:hAnsi="Calibri" w:eastAsia="Calibri"/>
+          <w:b/>
+          <w:color w:val="181818"/>
+          <w:sz w:val="22"/>
+        </w:rPr>
+        <w:t>Related</w:t>
+      </w:r>
+      <w:r>
+        <w:rPr>
+          <w:rFonts w:ascii="Calibri" w:hAnsi="Calibri" w:eastAsia="Calibri"/>
+          <w:b w:val="0"/>
+          <w:color w:val="181818"/>
+          <w:sz w:val="22"/>
+        </w:rPr>
+        <w:t xml:space="preserve"> list / </w:t>
+      </w:r>
+      <w:r>
+        <w:rPr>
+          <w:rFonts w:ascii="Calibri" w:hAnsi="Calibri" w:eastAsia="Calibri"/>
+          <w:b/>
+          <w:color w:val="181818"/>
+          <w:sz w:val="22"/>
+        </w:rPr>
+        <w:t>Approval History</w:t>
+      </w:r>
+      <w:r>
+        <w:rPr>
+          <w:rFonts w:ascii="Calibri" w:hAnsi="Calibri" w:eastAsia="Calibri"/>
+          <w:b w:val="0"/>
+          <w:color w:val="181818"/>
+          <w:sz w:val="22"/>
+        </w:rPr>
+        <w:t xml:space="preserve"> provides options to </w:t>
+      </w:r>
+      <w:r>
+        <w:rPr>
+          <w:rFonts w:ascii="Calibri" w:hAnsi="Calibri" w:eastAsia="Calibri"/>
+          <w:b/>
+          <w:color w:val="181818"/>
+          <w:sz w:val="22"/>
+        </w:rPr>
+        <w:t>Approve</w:t>
+      </w:r>
+      <w:r>
+        <w:rPr>
+          <w:rFonts w:ascii="Calibri" w:hAnsi="Calibri" w:eastAsia="Calibri"/>
+          <w:b w:val="0"/>
+          <w:color w:val="181818"/>
+          <w:sz w:val="22"/>
+        </w:rPr>
+        <w:t xml:space="preserve">, </w:t>
+      </w:r>
+      <w:r>
+        <w:rPr>
+          <w:rFonts w:ascii="Calibri" w:hAnsi="Calibri" w:eastAsia="Calibri"/>
+          <w:b/>
+          <w:color w:val="181818"/>
+          <w:sz w:val="22"/>
+        </w:rPr>
+        <w:t>Reject</w:t>
+      </w:r>
+      <w:r>
+        <w:rPr>
+          <w:rFonts w:ascii="Calibri" w:hAnsi="Calibri" w:eastAsia="Calibri"/>
+          <w:b w:val="0"/>
+          <w:color w:val="181818"/>
+          <w:sz w:val="22"/>
+        </w:rPr>
+        <w:t xml:space="preserve">, or </w:t>
+      </w:r>
+      <w:r>
+        <w:rPr>
+          <w:rFonts w:ascii="Calibri" w:hAnsi="Calibri" w:eastAsia="Calibri"/>
+          <w:b/>
+          <w:color w:val="181818"/>
+          <w:sz w:val="22"/>
+        </w:rPr>
+        <w:t>Recall</w:t>
+      </w:r>
+      <w:r>
+        <w:rPr>
+          <w:rFonts w:ascii="Calibri" w:hAnsi="Calibri" w:eastAsia="Calibri"/>
+          <w:b w:val="0"/>
+          <w:color w:val="181818"/>
+          <w:sz w:val="22"/>
+        </w:rPr>
+        <w:t>.</w:t>
+      </w:r>
+    </w:p>
+    <w:p>
+      <w:pPr>
         <w:pStyle w:val="Heading2"/>
         <w:spacing w:before="240" w:after="120" w:lineRule="auto" w:line="276"/>
       </w:pPr>
@@ -2955,7 +3112,7 @@
           <w:rFonts w:ascii="Calibri" w:hAnsi="Calibri"/>
           <w:color w:val="017EC5"/>
         </w:rPr>
-        <w:t>8.4 Steps</w:t>
+        <w:t>8.4 Submit for approval</w:t>
       </w:r>
     </w:p>
     <w:p>
@@ -3090,7 +3247,7 @@
           <w:color w:val="181818"/>
           <w:sz w:val="22"/>
         </w:rPr>
-        <w:t xml:space="preserve"> to track status (Submitted, Approved, Recalled, and so on).</w:t>
+        <w:t xml:space="preserve"> to track status (Submitted, Approved, Rejected, Recalled, and so on).</w:t>
       </w:r>
     </w:p>
     <w:p>
@@ -3258,6 +3415,604 @@
     </w:p>
     <w:p>
       <w:pPr>
+        <w:pStyle w:val="Heading2"/>
+        <w:spacing w:before="240" w:after="120" w:lineRule="auto" w:line="276"/>
+      </w:pPr>
+      <w:r>
+        <w:rPr>
+          <w:rFonts w:ascii="Calibri" w:hAnsi="Calibri"/>
+          <w:color w:val="017EC5"/>
+        </w:rPr>
+        <w:t>8.5 Approve, Reject, or Recall</w:t>
+      </w:r>
+    </w:p>
+    <w:p>
+      <w:pPr>
+        <w:spacing w:before="0" w:after="160" w:lineRule="auto" w:line="276"/>
+      </w:pPr>
+      <w:r>
+        <w:rPr>
+          <w:rFonts w:ascii="Calibri" w:hAnsi="Calibri" w:eastAsia="Calibri"/>
+          <w:b w:val="0"/>
+          <w:i w:val="0"/>
+          <w:color w:val="181818"/>
+          <w:sz w:val="22"/>
+        </w:rPr>
+        <w:t>After a Quote is submitted for approval, use Approval History on the Quote related list to take action:</w:t>
+      </w:r>
+    </w:p>
+    <w:p>
+      <w:pPr>
+        <w:pStyle w:val="ListBullet"/>
+        <w:spacing w:before="0" w:after="80" w:lineRule="auto" w:line="276"/>
+        <w:ind w:left="360"/>
+      </w:pPr>
+      <w:r>
+        <w:rPr>
+          <w:rFonts w:ascii="Calibri" w:hAnsi="Calibri" w:eastAsia="Calibri"/>
+          <w:b/>
+          <w:color w:val="181818"/>
+          <w:sz w:val="22"/>
+        </w:rPr>
+        <w:t>Approve</w:t>
+      </w:r>
+      <w:r>
+        <w:rPr>
+          <w:rFonts w:ascii="Calibri" w:hAnsi="Calibri" w:eastAsia="Calibri"/>
+          <w:b w:val="0"/>
+          <w:color w:val="181818"/>
+          <w:sz w:val="22"/>
+        </w:rPr>
+        <w:t xml:space="preserve"> — approve the pending approval request.</w:t>
+      </w:r>
+    </w:p>
+    <w:p>
+      <w:pPr>
+        <w:pStyle w:val="ListBullet"/>
+        <w:spacing w:before="0" w:after="80" w:lineRule="auto" w:line="276"/>
+        <w:ind w:left="360"/>
+      </w:pPr>
+      <w:r>
+        <w:rPr>
+          <w:rFonts w:ascii="Calibri" w:hAnsi="Calibri" w:eastAsia="Calibri"/>
+          <w:b/>
+          <w:color w:val="181818"/>
+          <w:sz w:val="22"/>
+        </w:rPr>
+        <w:t>Reject</w:t>
+      </w:r>
+      <w:r>
+        <w:rPr>
+          <w:rFonts w:ascii="Calibri" w:hAnsi="Calibri" w:eastAsia="Calibri"/>
+          <w:b w:val="0"/>
+          <w:color w:val="181818"/>
+          <w:sz w:val="22"/>
+        </w:rPr>
+        <w:t xml:space="preserve"> — reject the pending approval request.</w:t>
+      </w:r>
+    </w:p>
+    <w:p>
+      <w:pPr>
+        <w:pStyle w:val="ListBullet"/>
+        <w:spacing w:before="0" w:after="80" w:lineRule="auto" w:line="276"/>
+        <w:ind w:left="360"/>
+      </w:pPr>
+      <w:r>
+        <w:rPr>
+          <w:rFonts w:ascii="Calibri" w:hAnsi="Calibri" w:eastAsia="Calibri"/>
+          <w:b/>
+          <w:color w:val="181818"/>
+          <w:sz w:val="22"/>
+        </w:rPr>
+        <w:t>Recall</w:t>
+      </w:r>
+      <w:r>
+        <w:rPr>
+          <w:rFonts w:ascii="Calibri" w:hAnsi="Calibri" w:eastAsia="Calibri"/>
+          <w:b w:val="0"/>
+          <w:color w:val="181818"/>
+          <w:sz w:val="22"/>
+        </w:rPr>
+        <w:t xml:space="preserve"> — open the dropdown next to Reject and select </w:t>
+      </w:r>
+      <w:r>
+        <w:rPr>
+          <w:rFonts w:ascii="Calibri" w:hAnsi="Calibri" w:eastAsia="Calibri"/>
+          <w:b/>
+          <w:color w:val="181818"/>
+          <w:sz w:val="22"/>
+        </w:rPr>
+        <w:t>Recall</w:t>
+      </w:r>
+      <w:r>
+        <w:rPr>
+          <w:rFonts w:ascii="Calibri" w:hAnsi="Calibri" w:eastAsia="Calibri"/>
+          <w:b w:val="0"/>
+          <w:color w:val="181818"/>
+          <w:sz w:val="22"/>
+        </w:rPr>
+        <w:t xml:space="preserve"> to withdraw the approval request.</w:t>
+      </w:r>
+    </w:p>
+    <w:tbl>
+      <w:tblPr>
+        <w:tblW w:type="auto" w:w="0"/>
+        <w:jc w:val="center"/>
+        <w:tblLook w:firstColumn="1" w:firstRow="1" w:lastColumn="0" w:lastRow="0" w:noHBand="0" w:noVBand="1" w:val="04A0"/>
+      </w:tblPr>
+      <w:tblGrid>
+        <w:gridCol w:w="9648"/>
+      </w:tblGrid>
+      <w:tr>
+        <w:tc>
+          <w:tcPr>
+            <w:tcW w:type="dxa" w:w="9648"/>
+            <w:shd w:fill="FCE8E8" w:val="clear"/>
+          </w:tcPr>
+          <w:p>
+            <w:pPr>
+              <w:spacing w:before="80" w:after="40" w:lineRule="auto" w:line="276"/>
+            </w:pPr>
+            <w:r>
+              <w:rPr>
+                <w:rFonts w:ascii="Calibri" w:hAnsi="Calibri" w:eastAsia="Calibri"/>
+                <w:b/>
+                <w:color w:val="017EC5"/>
+                <w:sz w:val="20"/>
+              </w:rPr>
+              <w:t>RECALL STATUS</w:t>
+            </w:r>
+          </w:p>
+          <w:p>
+            <w:pPr>
+              <w:spacing w:before="0" w:after="80" w:lineRule="auto" w:line="276"/>
+            </w:pPr>
+            <w:r>
+              <w:rPr>
+                <w:rFonts w:ascii="Calibri" w:hAnsi="Calibri" w:eastAsia="Calibri"/>
+                <w:b w:val="0"/>
+                <w:color w:val="181818"/>
+                <w:sz w:val="20"/>
+              </w:rPr>
+              <w:t>If approval is recalled, Approval Status returns to Needs Approval.</w:t>
+            </w:r>
+          </w:p>
+        </w:tc>
+      </w:tr>
+    </w:tbl>
+    <w:p>
+      <w:pPr>
+        <w:spacing w:before="0" w:after="160" w:lineRule="auto" w:line="276"/>
+      </w:pPr>
+    </w:p>
+    <w:p>
+      <w:pPr>
+        <w:spacing w:before="160" w:after="80" w:lineRule="auto" w:line="276"/>
+        <w:jc w:val="center"/>
+      </w:pPr>
+      <w:r>
+        <w:drawing>
+          <wp:inline xmlns:a="http://schemas.openxmlformats.org/drawingml/2006/main" xmlns:pic="http://schemas.openxmlformats.org/drawingml/2006/picture">
+            <wp:extent cx="5486400" cy="2062307"/>
+            <wp:docPr id="10" name="Picture 10"/>
+            <wp:cNvGraphicFramePr>
+              <a:graphicFrameLocks noChangeAspect="1"/>
+            </wp:cNvGraphicFramePr>
+            <a:graphic>
+              <a:graphicData uri="http://schemas.openxmlformats.org/drawingml/2006/picture">
+                <pic:pic>
+                  <pic:nvPicPr>
+                    <pic:cNvPr id="0" name="image12.png"/>
+                    <pic:cNvPicPr/>
+                  </pic:nvPicPr>
+                  <pic:blipFill>
+                    <a:blip r:embed="rId18"/>
+                    <a:stretch>
+                      <a:fillRect/>
+                    </a:stretch>
+                  </pic:blipFill>
+                  <pic:spPr>
+                    <a:xfrm>
+                      <a:off x="0" y="0"/>
+                      <a:ext cx="5486400" cy="2062307"/>
+                    </a:xfrm>
+                    <a:prstGeom prst="rect"/>
+                  </pic:spPr>
+                </pic:pic>
+              </a:graphicData>
+            </a:graphic>
+          </wp:inline>
+        </w:drawing>
+      </w:r>
+    </w:p>
+    <w:p>
+      <w:pPr>
+        <w:spacing w:before="0" w:after="240" w:lineRule="auto" w:line="276"/>
+        <w:jc w:val="center"/>
+      </w:pPr>
+      <w:r>
+        <w:rPr>
+          <w:rFonts w:ascii="Calibri" w:hAnsi="Calibri" w:eastAsia="Calibri"/>
+          <w:b w:val="0"/>
+          <w:i/>
+          <w:color w:val="5C5C5C"/>
+          <w:sz w:val="18"/>
+        </w:rPr>
+        <w:t>Figure 10. Approval History — Approve, Reject, and Recall actions on a submitted Quote.</w:t>
+      </w:r>
+    </w:p>
+    <w:p>
+      <w:pPr>
+        <w:pStyle w:val="Heading2"/>
+        <w:spacing w:before="240" w:after="120" w:lineRule="auto" w:line="276"/>
+      </w:pPr>
+      <w:r>
+        <w:rPr>
+          <w:rFonts w:ascii="Calibri" w:hAnsi="Calibri"/>
+          <w:color w:val="017EC5"/>
+        </w:rPr>
+        <w:t>8.6 Approve or Reject from email</w:t>
+      </w:r>
+    </w:p>
+    <w:p>
+      <w:pPr>
+        <w:spacing w:before="0" w:after="160" w:lineRule="auto" w:line="276"/>
+      </w:pPr>
+      <w:r>
+        <w:rPr>
+          <w:rFonts w:ascii="Calibri" w:hAnsi="Calibri" w:eastAsia="Calibri"/>
+          <w:b w:val="0"/>
+          <w:i w:val="0"/>
+          <w:color w:val="181818"/>
+          <w:sz w:val="22"/>
+        </w:rPr>
+        <w:t>Once a Quote is submitted for approval, Salesforce sends an email notification to the approver. Approve and Reject options are enabled directly in the email, so the approver can take action without opening Salesforce.</w:t>
+      </w:r>
+    </w:p>
+    <w:p>
+      <w:pPr>
+        <w:pStyle w:val="ListNumber"/>
+        <w:spacing w:before="0" w:after="80" w:lineRule="auto" w:line="276"/>
+      </w:pPr>
+      <w:r>
+        <w:rPr>
+          <w:rFonts w:ascii="Calibri" w:hAnsi="Calibri" w:eastAsia="Calibri"/>
+          <w:b w:val="0"/>
+          <w:color w:val="181818"/>
+          <w:sz w:val="22"/>
+        </w:rPr>
+        <w:t>The approver receives an email when a Quote requires approval (for example, when margin is below the approved threshold).</w:t>
+      </w:r>
+    </w:p>
+    <w:p>
+      <w:pPr>
+        <w:pStyle w:val="ListNumber"/>
+        <w:spacing w:before="0" w:after="80" w:lineRule="auto" w:line="276"/>
+      </w:pPr>
+      <w:r>
+        <w:rPr>
+          <w:rFonts w:ascii="Calibri" w:hAnsi="Calibri" w:eastAsia="Calibri"/>
+          <w:b w:val="0"/>
+          <w:color w:val="181818"/>
+          <w:sz w:val="22"/>
+        </w:rPr>
+        <w:t xml:space="preserve">From the email, the approver can </w:t>
+      </w:r>
+      <w:r>
+        <w:rPr>
+          <w:rFonts w:ascii="Calibri" w:hAnsi="Calibri" w:eastAsia="Calibri"/>
+          <w:b/>
+          <w:color w:val="181818"/>
+          <w:sz w:val="22"/>
+        </w:rPr>
+        <w:t>Approve</w:t>
+      </w:r>
+      <w:r>
+        <w:rPr>
+          <w:rFonts w:ascii="Calibri" w:hAnsi="Calibri" w:eastAsia="Calibri"/>
+          <w:b w:val="0"/>
+          <w:color w:val="181818"/>
+          <w:sz w:val="22"/>
+        </w:rPr>
+        <w:t xml:space="preserve"> or </w:t>
+      </w:r>
+      <w:r>
+        <w:rPr>
+          <w:rFonts w:ascii="Calibri" w:hAnsi="Calibri" w:eastAsia="Calibri"/>
+          <w:b/>
+          <w:color w:val="181818"/>
+          <w:sz w:val="22"/>
+        </w:rPr>
+        <w:t>Reject</w:t>
+      </w:r>
+      <w:r>
+        <w:rPr>
+          <w:rFonts w:ascii="Calibri" w:hAnsi="Calibri" w:eastAsia="Calibri"/>
+          <w:b w:val="0"/>
+          <w:color w:val="181818"/>
+          <w:sz w:val="22"/>
+        </w:rPr>
+        <w:t xml:space="preserve"> (including by reply action where enabled).</w:t>
+      </w:r>
+    </w:p>
+    <w:p>
+      <w:pPr>
+        <w:pStyle w:val="ListNumber"/>
+        <w:spacing w:before="0" w:after="80" w:lineRule="auto" w:line="276"/>
+      </w:pPr>
+      <w:r>
+        <w:rPr>
+          <w:rFonts w:ascii="Calibri" w:hAnsi="Calibri" w:eastAsia="Calibri"/>
+          <w:b w:val="0"/>
+          <w:color w:val="181818"/>
+          <w:sz w:val="22"/>
+        </w:rPr>
+        <w:t>After the decision, the submitter / team receives the appropriate email notification that the Quote was approved or rejected.</w:t>
+      </w:r>
+    </w:p>
+    <w:p>
+      <w:pPr>
+        <w:spacing w:before="160" w:after="80" w:lineRule="auto" w:line="276"/>
+        <w:jc w:val="center"/>
+      </w:pPr>
+      <w:r>
+        <w:drawing>
+          <wp:inline xmlns:a="http://schemas.openxmlformats.org/drawingml/2006/main" xmlns:pic="http://schemas.openxmlformats.org/drawingml/2006/picture">
+            <wp:extent cx="4754880" cy="2298263"/>
+            <wp:docPr id="11" name="Picture 11"/>
+            <wp:cNvGraphicFramePr>
+              <a:graphicFrameLocks noChangeAspect="1"/>
+            </wp:cNvGraphicFramePr>
+            <a:graphic>
+              <a:graphicData uri="http://schemas.openxmlformats.org/drawingml/2006/picture">
+                <pic:pic>
+                  <pic:nvPicPr>
+                    <pic:cNvPr id="0" name="image14.png"/>
+                    <pic:cNvPicPr/>
+                  </pic:nvPicPr>
+                  <pic:blipFill>
+                    <a:blip r:embed="rId19"/>
+                    <a:stretch>
+                      <a:fillRect/>
+                    </a:stretch>
+                  </pic:blipFill>
+                  <pic:spPr>
+                    <a:xfrm>
+                      <a:off x="0" y="0"/>
+                      <a:ext cx="4754880" cy="2298263"/>
+                    </a:xfrm>
+                    <a:prstGeom prst="rect"/>
+                  </pic:spPr>
+                </pic:pic>
+              </a:graphicData>
+            </a:graphic>
+          </wp:inline>
+        </w:drawing>
+      </w:r>
+    </w:p>
+    <w:p>
+      <w:pPr>
+        <w:spacing w:before="0" w:after="240" w:lineRule="auto" w:line="276"/>
+        <w:jc w:val="center"/>
+      </w:pPr>
+      <w:r>
+        <w:rPr>
+          <w:rFonts w:ascii="Calibri" w:hAnsi="Calibri" w:eastAsia="Calibri"/>
+          <w:b w:val="0"/>
+          <w:i/>
+          <w:color w:val="5C5C5C"/>
+          <w:sz w:val="18"/>
+        </w:rPr>
+        <w:t>Figure 11. Approval request email — Quote requires approval when margin is below threshold.</w:t>
+      </w:r>
+    </w:p>
+    <w:p>
+      <w:pPr>
+        <w:spacing w:before="160" w:after="80" w:lineRule="auto" w:line="276"/>
+        <w:jc w:val="center"/>
+      </w:pPr>
+      <w:r>
+        <w:drawing>
+          <wp:inline xmlns:a="http://schemas.openxmlformats.org/drawingml/2006/main" xmlns:pic="http://schemas.openxmlformats.org/drawingml/2006/picture">
+            <wp:extent cx="4389120" cy="2516938"/>
+            <wp:docPr id="12" name="Picture 12"/>
+            <wp:cNvGraphicFramePr>
+              <a:graphicFrameLocks noChangeAspect="1"/>
+            </wp:cNvGraphicFramePr>
+            <a:graphic>
+              <a:graphicData uri="http://schemas.openxmlformats.org/drawingml/2006/picture">
+                <pic:pic>
+                  <pic:nvPicPr>
+                    <pic:cNvPr id="0" name="image13.png"/>
+                    <pic:cNvPicPr/>
+                  </pic:nvPicPr>
+                  <pic:blipFill>
+                    <a:blip r:embed="rId20"/>
+                    <a:stretch>
+                      <a:fillRect/>
+                    </a:stretch>
+                  </pic:blipFill>
+                  <pic:spPr>
+                    <a:xfrm>
+                      <a:off x="0" y="0"/>
+                      <a:ext cx="4389120" cy="2516938"/>
+                    </a:xfrm>
+                    <a:prstGeom prst="rect"/>
+                  </pic:spPr>
+                </pic:pic>
+              </a:graphicData>
+            </a:graphic>
+          </wp:inline>
+        </w:drawing>
+      </w:r>
+    </w:p>
+    <w:p>
+      <w:pPr>
+        <w:spacing w:before="0" w:after="240" w:lineRule="auto" w:line="276"/>
+        <w:jc w:val="center"/>
+      </w:pPr>
+      <w:r>
+        <w:rPr>
+          <w:rFonts w:ascii="Calibri" w:hAnsi="Calibri" w:eastAsia="Calibri"/>
+          <w:b w:val="0"/>
+          <w:i/>
+          <w:color w:val="5C5C5C"/>
+          <w:sz w:val="18"/>
+        </w:rPr>
+        <w:t>Figure 12. Email approval reply — approver can Approve (or Reject) from email.</w:t>
+      </w:r>
+    </w:p>
+    <w:p>
+      <w:pPr>
+        <w:pStyle w:val="Heading2"/>
+        <w:spacing w:before="240" w:after="120" w:lineRule="auto" w:line="276"/>
+      </w:pPr>
+      <w:r>
+        <w:rPr>
+          <w:rFonts w:ascii="Calibri" w:hAnsi="Calibri"/>
+          <w:color w:val="017EC5"/>
+        </w:rPr>
+        <w:t>8.7 Approval status summary</w:t>
+      </w:r>
+    </w:p>
+    <w:p>
+      <w:pPr>
+        <w:pStyle w:val="ListBullet"/>
+        <w:spacing w:before="0" w:after="80" w:lineRule="auto" w:line="276"/>
+        <w:ind w:left="360"/>
+      </w:pPr>
+      <w:r>
+        <w:rPr>
+          <w:rFonts w:ascii="Calibri" w:hAnsi="Calibri" w:eastAsia="Calibri"/>
+          <w:b w:val="0"/>
+          <w:color w:val="181818"/>
+          <w:sz w:val="22"/>
+        </w:rPr>
+        <w:t xml:space="preserve">When the approval condition is met → Approval Status = </w:t>
+      </w:r>
+      <w:r>
+        <w:rPr>
+          <w:rFonts w:ascii="Calibri" w:hAnsi="Calibri" w:eastAsia="Calibri"/>
+          <w:b/>
+          <w:color w:val="181818"/>
+          <w:sz w:val="22"/>
+        </w:rPr>
+        <w:t>Needs Approval</w:t>
+      </w:r>
+      <w:r>
+        <w:rPr>
+          <w:rFonts w:ascii="Calibri" w:hAnsi="Calibri" w:eastAsia="Calibri"/>
+          <w:b w:val="0"/>
+          <w:color w:val="181818"/>
+          <w:sz w:val="22"/>
+        </w:rPr>
+        <w:t>.</w:t>
+      </w:r>
+    </w:p>
+    <w:p>
+      <w:pPr>
+        <w:pStyle w:val="ListBullet"/>
+        <w:spacing w:before="0" w:after="80" w:lineRule="auto" w:line="276"/>
+        <w:ind w:left="360"/>
+      </w:pPr>
+      <w:r>
+        <w:rPr>
+          <w:rFonts w:ascii="Calibri" w:hAnsi="Calibri" w:eastAsia="Calibri"/>
+          <w:b w:val="0"/>
+          <w:color w:val="181818"/>
+          <w:sz w:val="22"/>
+        </w:rPr>
+        <w:t xml:space="preserve">After Submit for Approval → status = </w:t>
+      </w:r>
+      <w:r>
+        <w:rPr>
+          <w:rFonts w:ascii="Calibri" w:hAnsi="Calibri" w:eastAsia="Calibri"/>
+          <w:b/>
+          <w:color w:val="181818"/>
+          <w:sz w:val="22"/>
+        </w:rPr>
+        <w:t>In Review</w:t>
+      </w:r>
+      <w:r>
+        <w:rPr>
+          <w:rFonts w:ascii="Calibri" w:hAnsi="Calibri" w:eastAsia="Calibri"/>
+          <w:b w:val="0"/>
+          <w:color w:val="181818"/>
+          <w:sz w:val="22"/>
+        </w:rPr>
+        <w:t>.</w:t>
+      </w:r>
+    </w:p>
+    <w:p>
+      <w:pPr>
+        <w:pStyle w:val="ListBullet"/>
+        <w:spacing w:before="0" w:after="80" w:lineRule="auto" w:line="276"/>
+        <w:ind w:left="360"/>
+      </w:pPr>
+      <w:r>
+        <w:rPr>
+          <w:rFonts w:ascii="Calibri" w:hAnsi="Calibri" w:eastAsia="Calibri"/>
+          <w:b w:val="0"/>
+          <w:color w:val="181818"/>
+          <w:sz w:val="22"/>
+        </w:rPr>
+        <w:t xml:space="preserve">If approval is </w:t>
+      </w:r>
+      <w:r>
+        <w:rPr>
+          <w:rFonts w:ascii="Calibri" w:hAnsi="Calibri" w:eastAsia="Calibri"/>
+          <w:b/>
+          <w:color w:val="181818"/>
+          <w:sz w:val="22"/>
+        </w:rPr>
+        <w:t>Recalled</w:t>
+      </w:r>
+      <w:r>
+        <w:rPr>
+          <w:rFonts w:ascii="Calibri" w:hAnsi="Calibri" w:eastAsia="Calibri"/>
+          <w:b w:val="0"/>
+          <w:color w:val="181818"/>
+          <w:sz w:val="22"/>
+        </w:rPr>
+        <w:t xml:space="preserve"> → status returns to </w:t>
+      </w:r>
+      <w:r>
+        <w:rPr>
+          <w:rFonts w:ascii="Calibri" w:hAnsi="Calibri" w:eastAsia="Calibri"/>
+          <w:b/>
+          <w:color w:val="181818"/>
+          <w:sz w:val="22"/>
+        </w:rPr>
+        <w:t>Needs Approval</w:t>
+      </w:r>
+      <w:r>
+        <w:rPr>
+          <w:rFonts w:ascii="Calibri" w:hAnsi="Calibri" w:eastAsia="Calibri"/>
+          <w:b w:val="0"/>
+          <w:color w:val="181818"/>
+          <w:sz w:val="22"/>
+        </w:rPr>
+        <w:t>.</w:t>
+      </w:r>
+    </w:p>
+    <w:p>
+      <w:pPr>
+        <w:pStyle w:val="ListBullet"/>
+        <w:spacing w:before="0" w:after="80" w:lineRule="auto" w:line="276"/>
+        <w:ind w:left="360"/>
+      </w:pPr>
+      <w:r>
+        <w:rPr>
+          <w:rFonts w:ascii="Calibri" w:hAnsi="Calibri" w:eastAsia="Calibri"/>
+          <w:b w:val="0"/>
+          <w:color w:val="181818"/>
+          <w:sz w:val="22"/>
+        </w:rPr>
+        <w:t>If approved or rejected → the related party receives email notification.</w:t>
+      </w:r>
+    </w:p>
+    <w:p>
+      <w:pPr>
         <w:pStyle w:val="Heading1"/>
         <w:spacing w:before="320" w:after="120" w:lineRule="auto" w:line="276"/>
       </w:pPr>
@@ -3408,7 +4163,7 @@
         <w:drawing>
           <wp:inline xmlns:a="http://schemas.openxmlformats.org/drawingml/2006/main" xmlns:pic="http://schemas.openxmlformats.org/drawingml/2006/picture">
             <wp:extent cx="5120640" cy="2842294"/>
-            <wp:docPr id="10" name="Picture 10"/>
+            <wp:docPr id="13" name="Picture 13"/>
             <wp:cNvGraphicFramePr>
               <a:graphicFrameLocks noChangeAspect="1"/>
             </wp:cNvGraphicFramePr>
@@ -3420,7 +4175,7 @@
                     <pic:cNvPicPr/>
                   </pic:nvPicPr>
                   <pic:blipFill>
-                    <a:blip r:embed="rId18"/>
+                    <a:blip r:embed="rId21"/>
                     <a:stretch>
                       <a:fillRect/>
                     </a:stretch>
@@ -3452,7 +4207,7 @@
           <w:color w:val="5C5C5C"/>
           <w:sz w:val="18"/>
         </w:rPr>
-        <w:t>Figure 10. Create Order — select Create Single Order, then continue.</w:t>
+        <w:t>Figure 13. Create Order — select Create Single Order, then continue.</w:t>
       </w:r>
     </w:p>
     <w:tbl>
@@ -3640,7 +4395,7 @@
         <w:drawing>
           <wp:inline xmlns:a="http://schemas.openxmlformats.org/drawingml/2006/main" xmlns:pic="http://schemas.openxmlformats.org/drawingml/2006/picture">
             <wp:extent cx="5486400" cy="1164401"/>
-            <wp:docPr id="11" name="Picture 11"/>
+            <wp:docPr id="14" name="Picture 14"/>
             <wp:cNvGraphicFramePr>
               <a:graphicFrameLocks noChangeAspect="1"/>
             </wp:cNvGraphicFramePr>
@@ -3652,7 +4407,7 @@
                     <pic:cNvPicPr/>
                   </pic:nvPicPr>
                   <pic:blipFill>
-                    <a:blip r:embed="rId19"/>
+                    <a:blip r:embed="rId22"/>
                     <a:stretch>
                       <a:fillRect/>
                     </a:stretch>
@@ -3684,7 +4439,7 @@
           <w:color w:val="5C5C5C"/>
           <w:sz w:val="18"/>
         </w:rPr>
-        <w:t>Figure 11. Order header — Generate Order Doc and Send Order Doc.</w:t>
+        <w:t>Figure 14. Order header — Generate Order Doc and Send Order Doc.</w:t>
       </w:r>
     </w:p>
     <w:p>
@@ -4207,6 +4962,117 @@
                 <w:color w:val="181818"/>
                 <w:sz w:val="20"/>
               </w:rPr>
+              <w:t>Approve / Reject / Recall</w:t>
+            </w:r>
+          </w:p>
+        </w:tc>
+        <w:tc>
+          <w:tcPr>
+            <w:tcW w:type="dxa" w:w="4824"/>
+            <w:shd w:fill="F4F6F9" w:val="clear"/>
+          </w:tcPr>
+          <w:p>
+            <w:r/>
+            <w:r>
+              <w:rPr>
+                <w:rFonts w:ascii="Calibri" w:hAnsi="Calibri" w:eastAsia="Calibri"/>
+                <w:b w:val="0"/>
+                <w:color w:val="181818"/>
+                <w:sz w:val="20"/>
+              </w:rPr>
+              <w:t>From Approval History after submit; Recall returns status to Needs Approval</w:t>
+            </w:r>
+          </w:p>
+        </w:tc>
+      </w:tr>
+      <w:tr>
+        <w:tc>
+          <w:tcPr>
+            <w:tcW w:type="dxa" w:w="4824"/>
+          </w:tcPr>
+          <w:p>
+            <w:r/>
+            <w:r>
+              <w:rPr>
+                <w:rFonts w:ascii="Calibri" w:hAnsi="Calibri" w:eastAsia="Calibri"/>
+                <w:b/>
+                <w:color w:val="181818"/>
+                <w:sz w:val="20"/>
+              </w:rPr>
+              <w:t>Email approval</w:t>
+            </w:r>
+          </w:p>
+        </w:tc>
+        <w:tc>
+          <w:tcPr>
+            <w:tcW w:type="dxa" w:w="4824"/>
+          </w:tcPr>
+          <w:p>
+            <w:r/>
+            <w:r>
+              <w:rPr>
+                <w:rFonts w:ascii="Calibri" w:hAnsi="Calibri" w:eastAsia="Calibri"/>
+                <w:b w:val="0"/>
+                <w:color w:val="181818"/>
+                <w:sz w:val="20"/>
+              </w:rPr>
+              <w:t>Approver can Approve or Reject from email; notifications sent on decision</w:t>
+            </w:r>
+          </w:p>
+        </w:tc>
+      </w:tr>
+      <w:tr>
+        <w:tc>
+          <w:tcPr>
+            <w:tcW w:type="dxa" w:w="4824"/>
+            <w:shd w:fill="F4F6F9" w:val="clear"/>
+          </w:tcPr>
+          <w:p>
+            <w:r/>
+            <w:r>
+              <w:rPr>
+                <w:rFonts w:ascii="Calibri" w:hAnsi="Calibri" w:eastAsia="Calibri"/>
+                <w:b/>
+                <w:color w:val="181818"/>
+                <w:sz w:val="20"/>
+              </w:rPr>
+              <w:t>Approval statuses</w:t>
+            </w:r>
+          </w:p>
+        </w:tc>
+        <w:tc>
+          <w:tcPr>
+            <w:tcW w:type="dxa" w:w="4824"/>
+            <w:shd w:fill="F4F6F9" w:val="clear"/>
+          </w:tcPr>
+          <w:p>
+            <w:r/>
+            <w:r>
+              <w:rPr>
+                <w:rFonts w:ascii="Calibri" w:hAnsi="Calibri" w:eastAsia="Calibri"/>
+                <w:b w:val="0"/>
+                <w:color w:val="181818"/>
+                <w:sz w:val="20"/>
+              </w:rPr>
+              <w:t>Needs Approval (condition met / after recall) → In Review (submitted)</w:t>
+            </w:r>
+          </w:p>
+        </w:tc>
+      </w:tr>
+      <w:tr>
+        <w:tc>
+          <w:tcPr>
+            <w:tcW w:type="dxa" w:w="4824"/>
+          </w:tcPr>
+          <w:p>
+            <w:r/>
+            <w:r>
+              <w:rPr>
+                <w:rFonts w:ascii="Calibri" w:hAnsi="Calibri" w:eastAsia="Calibri"/>
+                <w:b/>
+                <w:color w:val="181818"/>
+                <w:sz w:val="20"/>
+              </w:rPr>
               <w:t>Quote gate</w:t>
             </w:r>
           </w:p>
@@ -4214,7 +5080,6 @@
         <w:tc>
           <w:tcPr>
             <w:tcW w:type="dxa" w:w="4824"/>
-            <w:shd w:fill="F4F6F9" w:val="clear"/>
           </w:tcPr>
           <w:p>
             <w:r/>
@@ -4234,6 +5099,7 @@
         <w:tc>
           <w:tcPr>
             <w:tcW w:type="dxa" w:w="4824"/>
+            <w:shd w:fill="F4F6F9" w:val="clear"/>
           </w:tcPr>
           <w:p>
             <w:r/>
@@ -4251,6 +5117,7 @@
         <w:tc>
           <w:tcPr>
             <w:tcW w:type="dxa" w:w="4824"/>
+            <w:shd w:fill="F4F6F9" w:val="clear"/>
           </w:tcPr>
           <w:p>
             <w:r/>
@@ -4270,7 +5137,6 @@
         <w:tc>
           <w:tcPr>
             <w:tcW w:type="dxa" w:w="4824"/>
-            <w:shd w:fill="F4F6F9" w:val="clear"/>
           </w:tcPr>
           <w:p>
             <w:r/>
@@ -4288,7 +5154,6 @@
         <w:tc>
           <w:tcPr>
             <w:tcW w:type="dxa" w:w="4824"/>
-            <w:shd w:fill="F4F6F9" w:val="clear"/>
           </w:tcPr>
           <w:p>
             <w:r/>

</xml_diff>